<commit_message>
implement checks for text
</commit_message>
<xml_diff>
--- a/backend/test-input/test2.docx
+++ b/backend/test-input/test2.docx
@@ -25,7 +25,7 @@
           <w:pPr>
             <w:pStyle w:val="TOC1"/>
             <w:tabs>
-              <w:tab w:val="clear" w:pos="708"/>
+              <w:tab w:val="clear" w:pos="643"/>
               <w:tab w:val="right" w:pos="9353" w:leader="dot"/>
             </w:tabs>
             <w:rPr/>
@@ -50,7 +50,7 @@
               <w:rPr>
                 <w:rStyle w:val="Style19"/>
               </w:rPr>
-              <w:t>СПИСОК СОКРАЩЕНИЙ И УСЛОВНЫХ ОБОЗНАЧЕНИЙ</w:t>
+              <w:t>СПИСОК СОКРАЩЕНИЙ И УСЛОВНЫХ ГСЧ ОБОЗНАЧЕНИЙa.</w:t>
               <w:tab/>
               <w:t>8</w:t>
             </w:r>
@@ -60,7 +60,7 @@
           <w:pPr>
             <w:pStyle w:val="TOC1"/>
             <w:tabs>
-              <w:tab w:val="clear" w:pos="708"/>
+              <w:tab w:val="clear" w:pos="643"/>
               <w:tab w:val="right" w:pos="9353" w:leader="dot"/>
             </w:tabs>
             <w:rPr/>
@@ -70,7 +70,7 @@
               <w:rPr>
                 <w:rStyle w:val="Style19"/>
               </w:rPr>
-              <w:t>ТЕРМИНЫ И ОПРЕДЕЛЕНИЯ</w:t>
+              <w:t>ТЕРМИНЫ И ОПРЕДЕЛЕНИЯ АААААААА ПЕНИ-СССССССССС</w:t>
               <w:tab/>
               <w:t>9</w:t>
             </w:r>
@@ -80,7 +80,7 @@
           <w:pPr>
             <w:pStyle w:val="TOC1"/>
             <w:tabs>
-              <w:tab w:val="clear" w:pos="708"/>
+              <w:tab w:val="clear" w:pos="643"/>
               <w:tab w:val="right" w:pos="9353" w:leader="dot"/>
             </w:tabs>
             <w:rPr/>
@@ -106,7 +106,7 @@
           <w:pPr>
             <w:pStyle w:val="TOC1"/>
             <w:tabs>
-              <w:tab w:val="clear" w:pos="708"/>
+              <w:tab w:val="clear" w:pos="643"/>
               <w:tab w:val="right" w:pos="9353" w:leader="dot"/>
             </w:tabs>
             <w:rPr/>
@@ -126,7 +126,7 @@
           <w:pPr>
             <w:pStyle w:val="TOC2"/>
             <w:tabs>
-              <w:tab w:val="clear" w:pos="708"/>
+              <w:tab w:val="clear" w:pos="643"/>
               <w:tab w:val="right" w:pos="9353" w:leader="dot"/>
             </w:tabs>
             <w:rPr/>
@@ -146,7 +146,7 @@
           <w:pPr>
             <w:pStyle w:val="TOC2"/>
             <w:tabs>
-              <w:tab w:val="clear" w:pos="708"/>
+              <w:tab w:val="clear" w:pos="643"/>
               <w:tab w:val="right" w:pos="9353" w:leader="dot"/>
             </w:tabs>
             <w:rPr/>
@@ -164,29 +164,9 @@
         </w:p>
         <w:p>
           <w:pPr>
-            <w:pStyle w:val="TOC2"/>
-            <w:tabs>
-              <w:tab w:val="clear" w:pos="708"/>
-              <w:tab w:val="right" w:pos="9353" w:leader="dot"/>
-            </w:tabs>
-            <w:rPr/>
-          </w:pPr>
-          <w:hyperlink w:anchor="__RefHeading___Toc1321_1361387627">
-            <w:r>
-              <w:rPr>
-                <w:rStyle w:val="Style19"/>
-              </w:rPr>
-              <w:t>1.7 Маленький пенис</w:t>
-              <w:tab/>
-              <w:t>10</w:t>
-            </w:r>
-          </w:hyperlink>
-        </w:p>
-        <w:p>
-          <w:pPr>
             <w:pStyle w:val="TOC1"/>
             <w:tabs>
-              <w:tab w:val="clear" w:pos="708"/>
+              <w:tab w:val="clear" w:pos="643"/>
               <w:tab w:val="right" w:pos="9353" w:leader="dot"/>
             </w:tabs>
             <w:rPr/>
@@ -196,7 +176,7 @@
               <w:rPr>
                 <w:rStyle w:val="Style19"/>
               </w:rPr>
-              <w:t>2. ПРОЕКТНЫЙ РАЗДЕЛ</w:t>
+              <w:t>2. Проектный раздел.</w:t>
               <w:tab/>
               <w:t>11</w:t>
             </w:r>
@@ -206,7 +186,7 @@
           <w:pPr>
             <w:pStyle w:val="TOC2"/>
             <w:tabs>
-              <w:tab w:val="clear" w:pos="708"/>
+              <w:tab w:val="clear" w:pos="643"/>
               <w:tab w:val="right" w:pos="9353" w:leader="dot"/>
             </w:tabs>
             <w:rPr/>
@@ -226,7 +206,7 @@
           <w:pPr>
             <w:pStyle w:val="TOC2"/>
             <w:tabs>
-              <w:tab w:val="clear" w:pos="708"/>
+              <w:tab w:val="clear" w:pos="643"/>
               <w:tab w:val="right" w:pos="9353" w:leader="dot"/>
             </w:tabs>
             <w:rPr/>
@@ -246,7 +226,7 @@
           <w:pPr>
             <w:pStyle w:val="TOC1"/>
             <w:tabs>
-              <w:tab w:val="clear" w:pos="708"/>
+              <w:tab w:val="clear" w:pos="643"/>
               <w:tab w:val="right" w:pos="9353" w:leader="dot"/>
             </w:tabs>
             <w:rPr/>
@@ -262,7 +242,7 @@
               <w:rPr>
                 <w:rStyle w:val="Style19"/>
               </w:rPr>
-              <w:t>3. РАЗРАБОТКА</w:t>
+              <w:t>3. Разработка</w:t>
               <w:tab/>
               <w:t>11</w:t>
             </w:r>
@@ -272,7 +252,7 @@
           <w:pPr>
             <w:pStyle w:val="TOC2"/>
             <w:tabs>
-              <w:tab w:val="clear" w:pos="708"/>
+              <w:tab w:val="clear" w:pos="643"/>
               <w:tab w:val="right" w:pos="9353" w:leader="dot"/>
             </w:tabs>
             <w:rPr/>
@@ -292,7 +272,7 @@
           <w:pPr>
             <w:pStyle w:val="TOC2"/>
             <w:tabs>
-              <w:tab w:val="clear" w:pos="708"/>
+              <w:tab w:val="clear" w:pos="643"/>
               <w:tab w:val="right" w:pos="9353" w:leader="dot"/>
             </w:tabs>
             <w:rPr/>
@@ -312,7 +292,7 @@
           <w:pPr>
             <w:pStyle w:val="TOC2"/>
             <w:tabs>
-              <w:tab w:val="clear" w:pos="708"/>
+              <w:tab w:val="clear" w:pos="643"/>
               <w:tab w:val="right" w:pos="9353" w:leader="dot"/>
             </w:tabs>
             <w:rPr/>
@@ -332,7 +312,7 @@
           <w:pPr>
             <w:pStyle w:val="TOC2"/>
             <w:tabs>
-              <w:tab w:val="clear" w:pos="708"/>
+              <w:tab w:val="clear" w:pos="643"/>
               <w:tab w:val="right" w:pos="9353" w:leader="dot"/>
             </w:tabs>
             <w:rPr/>
@@ -352,12 +332,12 @@
           <w:pPr>
             <w:pStyle w:val="TOC2"/>
             <w:tabs>
-              <w:tab w:val="clear" w:pos="708"/>
+              <w:tab w:val="clear" w:pos="643"/>
               <w:tab w:val="right" w:pos="9353" w:leader="dot"/>
             </w:tabs>
             <w:rPr/>
           </w:pPr>
-          <w:hyperlink w:anchor="__RefHeading___Toc1344_1361387627">
+          <w:hyperlink w:anchor="__RefHeading___Toc1486_2414042469">
             <w:r>
               <w:rPr>
                 <w:rStyle w:val="Style19"/>
@@ -372,7 +352,7 @@
           <w:pPr>
             <w:pStyle w:val="TOC1"/>
             <w:tabs>
-              <w:tab w:val="clear" w:pos="708"/>
+              <w:tab w:val="clear" w:pos="643"/>
               <w:tab w:val="right" w:pos="9353" w:leader="dot"/>
             </w:tabs>
             <w:rPr/>
@@ -392,7 +372,7 @@
           <w:pPr>
             <w:pStyle w:val="TOC2"/>
             <w:tabs>
-              <w:tab w:val="clear" w:pos="708"/>
+              <w:tab w:val="clear" w:pos="643"/>
               <w:tab w:val="right" w:pos="9353" w:leader="dot"/>
             </w:tabs>
             <w:rPr/>
@@ -412,12 +392,12 @@
           <w:pPr>
             <w:pStyle w:val="TOC2"/>
             <w:tabs>
-              <w:tab w:val="clear" w:pos="708"/>
+              <w:tab w:val="clear" w:pos="643"/>
               <w:tab w:val="right" w:pos="9353" w:leader="dot"/>
             </w:tabs>
             <w:rPr/>
           </w:pPr>
-          <w:hyperlink w:anchor="__RefHeading___Toc1325_1361387627">
+          <w:hyperlink w:anchor="__RefHeading___Toc1488_2414042469">
             <w:r>
               <w:rPr>
                 <w:rStyle w:val="Style19"/>
@@ -431,7 +411,7 @@
           <w:pPr>
             <w:pStyle w:val="TOC1"/>
             <w:tabs>
-              <w:tab w:val="clear" w:pos="708"/>
+              <w:tab w:val="clear" w:pos="643"/>
               <w:tab w:val="right" w:pos="9353" w:leader="dot"/>
             </w:tabs>
             <w:rPr/>
@@ -451,27 +431,7 @@
           <w:pPr>
             <w:pStyle w:val="TOC1"/>
             <w:tabs>
-              <w:tab w:val="clear" w:pos="708"/>
-              <w:tab w:val="right" w:pos="9353" w:leader="dot"/>
-            </w:tabs>
-            <w:rPr/>
-          </w:pPr>
-          <w:hyperlink w:anchor="__RefHeading___Toc1327_1361387627">
-            <w:r>
-              <w:rPr>
-                <w:rStyle w:val="Style19"/>
-              </w:rPr>
-              <w:t>СПИСОК ИСПОЛЬЗОВАННЫХ ИСТОЧНИКОВ</w:t>
-              <w:tab/>
-              <w:t>13</w:t>
-            </w:r>
-          </w:hyperlink>
-        </w:p>
-        <w:p>
-          <w:pPr>
-            <w:pStyle w:val="TOC1"/>
-            <w:tabs>
-              <w:tab w:val="clear" w:pos="708"/>
+              <w:tab w:val="clear" w:pos="643"/>
               <w:tab w:val="right" w:pos="9353" w:leader="dot"/>
             </w:tabs>
             <w:rPr/>
@@ -491,7 +451,7 @@
           <w:pPr>
             <w:pStyle w:val="TOC1"/>
             <w:tabs>
-              <w:tab w:val="clear" w:pos="708"/>
+              <w:tab w:val="clear" w:pos="643"/>
               <w:tab w:val="right" w:pos="9353" w:leader="dot"/>
             </w:tabs>
             <w:rPr/>
@@ -511,7 +471,7 @@
           <w:pPr>
             <w:pStyle w:val="TOC1"/>
             <w:tabs>
-              <w:tab w:val="clear" w:pos="708"/>
+              <w:tab w:val="clear" w:pos="643"/>
               <w:tab w:val="right" w:pos="9353" w:leader="dot"/>
             </w:tabs>
             <w:rPr/>
@@ -557,15 +517,29 @@
         <w:rPr/>
       </w:pPr>
       <w:bookmarkStart w:id="0" w:name="__RefHeading___Toc13668_1734033060"/>
-      <w:bookmarkStart w:id="1" w:name="_Toc140087571"/>
-      <w:bookmarkStart w:id="2" w:name="_Toc130343945"/>
+      <w:bookmarkStart w:id="1" w:name="_Toc130343945"/>
+      <w:bookmarkStart w:id="2" w:name="_Toc140087571"/>
       <w:bookmarkEnd w:id="0"/>
       <w:r>
         <w:rPr/>
-        <w:t>СПИСОК СОКРАЩЕНИЙ И УСЛОВНЫХ ОБОЗНАЧЕНИЙ</w:t>
+        <w:t xml:space="preserve">СПИСОК СОКРАЩЕНИЙ И УСЛОВНЫХ </w:t>
+      </w:r>
+      <w:r>
+        <w:rPr/>
+        <w:t>ГСЧ</w:t>
+      </w:r>
+      <w:r>
+        <w:rPr/>
+        <w:t xml:space="preserve"> ОБОЗНАЧЕНИЙ</w:t>
       </w:r>
       <w:bookmarkEnd w:id="1"/>
       <w:bookmarkEnd w:id="2"/>
+      <w:r>
+        <w:rPr>
+          <w:lang w:val="en-US"/>
+        </w:rPr>
+        <w:t>a.</w:t>
+      </w:r>
     </w:p>
     <w:p>
       <w:pPr>
@@ -700,6 +674,18 @@
         <w:t>ОПРЕДЕЛЕНИЯ</w:t>
       </w:r>
       <w:bookmarkEnd w:id="4"/>
+      <w:r>
+        <w:rPr>
+          <w:lang w:val="en-US"/>
+        </w:rPr>
+        <w:t xml:space="preserve"> </w:t>
+      </w:r>
+      <w:r>
+        <w:rPr>
+          <w:lang w:val="ru-RU"/>
+        </w:rPr>
+        <w:t>АААААААА ПЕНИ-СССССССССС</w:t>
+      </w:r>
     </w:p>
     <w:p>
       <w:pPr>
@@ -789,8 +775,8 @@
         <w:rPr/>
         <w:br/>
       </w:r>
-      <w:bookmarkStart w:id="6" w:name="_Toc140087573"/>
-      <w:bookmarkStart w:id="7" w:name="_Toc130343946"/>
+      <w:bookmarkStart w:id="6" w:name="_Toc130343946"/>
+      <w:bookmarkStart w:id="7" w:name="_Toc140087573"/>
       <w:r>
         <w:rPr/>
         <w:t>ВВЕДЕНИЕ</w:t>
@@ -820,7 +806,9 @@
         </w:rPr>
       </w:pPr>
       <w:r>
-        <w:rPr/>
+        <w:rPr>
+          <w:rFonts w:eastAsia="Webdings" w:cs="Webdings" w:ascii="Webdings" w:hAnsi="Webdings"/>
+        </w:rPr>
         <w:sym w:font="Webdings" w:char="423"/>
         <w:sym w:font="Webdings" w:char="447"/>
         <w:sym w:font="Webdings" w:char="438"/>
@@ -1148,6 +1136,7 @@
       </w:r>
       <w:r>
         <w:rPr>
+          <w:rFonts w:eastAsia="Webdings" w:cs="Webdings" w:ascii="Webdings" w:hAnsi="Webdings"/>
           <w:color w:val="C9211E"/>
         </w:rPr>
         <w:sym w:font="Webdings" w:char="432"/>
@@ -1283,26 +1272,6 @@
       </w:r>
       <w:bookmarkStart w:id="12" w:name="__RefHeading___Toc12424_1734033060"/>
       <w:bookmarkEnd w:id="12"/>
-    </w:p>
-    <w:p>
-      <w:pPr>
-        <w:pStyle w:val="-21"/>
-        <w:rPr>
-          <w:lang w:val="ru-RU"/>
-        </w:rPr>
-      </w:pPr>
-      <w:bookmarkStart w:id="13" w:name="__RefHeading___Toc1319_1361387627"/>
-      <w:bookmarkStart w:id="14" w:name="_Toc140087576"/>
-      <w:bookmarkEnd w:id="13"/>
-      <w:r>
-        <w:rPr/>
-        <w:t>1.6 Выв</w:t>
-      </w:r>
-      <w:bookmarkEnd w:id="14"/>
-      <w:r>
-        <w:rPr/>
-        <w:t>оды</w:t>
-      </w:r>
     </w:p>
     <w:p>
       <w:pPr>
@@ -1323,29 +1292,37 @@
           <w:lang w:val="ru-RU"/>
         </w:rPr>
       </w:pPr>
+      <w:bookmarkStart w:id="13" w:name="__RefHeading___Toc1319_1361387627"/>
+      <w:bookmarkStart w:id="14" w:name="_Toc140087576"/>
+      <w:bookmarkEnd w:id="13"/>
       <w:r>
         <w:rPr/>
+        <w:t>1.6 Выв</w:t>
+      </w:r>
+      <w:bookmarkEnd w:id="14"/>
+      <w:r>
+        <w:rPr/>
+        <w:t>оды</w:t>
       </w:r>
       <w:bookmarkStart w:id="15" w:name="__RefHeading___Toc1321_1361387627"/>
-      <w:bookmarkStart w:id="16" w:name="__RefHeading___Toc1321_1361387627"/>
-      <w:bookmarkEnd w:id="16"/>
     </w:p>
     <w:p>
       <w:pPr>
         <w:pStyle w:val="-3"/>
         <w:rPr/>
       </w:pPr>
-      <w:bookmarkStart w:id="17" w:name="__RefHeading___Toc12426_1734033060"/>
-      <w:bookmarkStart w:id="18" w:name="_Toc140087577"/>
-      <w:bookmarkEnd w:id="17"/>
+      <w:bookmarkStart w:id="16" w:name="__RefHeading___Toc12426_1734033060"/>
+      <w:bookmarkStart w:id="17" w:name="_Toc140087577"/>
+      <w:bookmarkEnd w:id="15"/>
+      <w:bookmarkEnd w:id="16"/>
       <w:r>
         <w:rPr/>
         <w:t xml:space="preserve">2. </w:t>
       </w:r>
-      <w:bookmarkEnd w:id="18"/>
+      <w:bookmarkEnd w:id="17"/>
       <w:r>
         <w:rPr/>
-        <w:t>ПРОЕКТНЫЙ РАЗДЕЛ</w:t>
+        <w:t>Проектный раздел.</w:t>
       </w:r>
     </w:p>
     <w:p>
@@ -1356,16 +1333,16 @@
           <w:lang w:val="ru-RU"/>
         </w:rPr>
       </w:pPr>
-      <w:bookmarkStart w:id="19" w:name="__RefHeading___Toc12428_1734033060"/>
-      <w:bookmarkStart w:id="20" w:name="_Toc140087578"/>
+      <w:bookmarkStart w:id="18" w:name="__RefHeading___Toc12428_1734033060"/>
+      <w:bookmarkStart w:id="19" w:name="_Toc140087578"/>
+      <w:bookmarkEnd w:id="18"/>
+      <w:r>
+        <w:rPr>
+          <w:lang w:val="ru-RU"/>
+        </w:rPr>
+        <w:t xml:space="preserve">2.1 </w:t>
+      </w:r>
       <w:bookmarkEnd w:id="19"/>
-      <w:r>
-        <w:rPr>
-          <w:lang w:val="ru-RU"/>
-        </w:rPr>
-        <w:t xml:space="preserve">2.1 </w:t>
-      </w:r>
-      <w:bookmarkEnd w:id="20"/>
       <w:r>
         <w:rPr>
           <w:lang w:val="ru-RU"/>
@@ -1379,7 +1356,7 @@
         </w:rPr>
         <w:t xml:space="preserve"> </w:t>
       </w:r>
-      <w:bookmarkStart w:id="21" w:name="__RefHeading___Toc12430_1734033060"/>
+      <w:bookmarkStart w:id="20" w:name="__RefHeading___Toc12430_1734033060"/>
     </w:p>
     <w:p>
       <w:pPr>
@@ -1388,15 +1365,15 @@
           <w:lang w:val="ru-RU"/>
         </w:rPr>
       </w:pPr>
-      <w:bookmarkStart w:id="22" w:name="__RefHeading___Toc1323_1361387627"/>
-      <w:bookmarkStart w:id="23" w:name="_Toc140087579"/>
+      <w:bookmarkStart w:id="21" w:name="__RefHeading___Toc1323_1361387627"/>
+      <w:bookmarkStart w:id="22" w:name="_Toc140087579"/>
+      <w:bookmarkEnd w:id="20"/>
       <w:bookmarkEnd w:id="21"/>
-      <w:bookmarkEnd w:id="22"/>
       <w:r>
         <w:rPr/>
         <w:t>2.6 Вывод</w:t>
       </w:r>
-      <w:bookmarkEnd w:id="23"/>
+      <w:bookmarkEnd w:id="22"/>
       <w:r>
         <w:rPr/>
         <w:t>ы</w:t>
@@ -1407,8 +1384,8 @@
         <w:pStyle w:val="-3"/>
         <w:rPr/>
       </w:pPr>
-      <w:bookmarkStart w:id="24" w:name="__RefHeading___Toc12432_1734033060_Копия"/>
-      <w:bookmarkEnd w:id="24"/>
+      <w:bookmarkStart w:id="23" w:name="__RefHeading___Toc12432_1734033060_Копия"/>
+      <w:bookmarkEnd w:id="23"/>
       <w:r>
         <w:rPr>
           <w:lang w:val="ru-RU"/>
@@ -1417,15 +1394,21 @@
         <w:br/>
         <w:br/>
       </w:r>
-      <w:bookmarkStart w:id="25" w:name="_Toc140087580_Копия_2"/>
-      <w:r>
-        <w:rPr/>
+      <w:bookmarkStart w:id="24" w:name="_Toc140087580_Копия_2"/>
+      <w:r>
+        <w:rPr>
+          <w:b w:val="false"/>
+          <w:bCs w:val="false"/>
+        </w:rPr>
         <w:t xml:space="preserve">3. </w:t>
       </w:r>
-      <w:bookmarkEnd w:id="25"/>
-      <w:r>
-        <w:rPr/>
-        <w:t>РАЗРАБОТКА</w:t>
+      <w:bookmarkEnd w:id="24"/>
+      <w:r>
+        <w:rPr>
+          <w:b w:val="false"/>
+          <w:bCs w:val="false"/>
+        </w:rPr>
+        <w:t>Разработка</w:t>
       </w:r>
     </w:p>
     <w:p>
@@ -1436,22 +1419,22 @@
           <w:lang w:val="ru-RU"/>
         </w:rPr>
       </w:pPr>
-      <w:bookmarkStart w:id="26" w:name="__RefHeading___Toc12428_1734033060_Копия"/>
+      <w:bookmarkStart w:id="25" w:name="__RefHeading___Toc12428_1734033060_Копия"/>
+      <w:bookmarkEnd w:id="25"/>
+      <w:r>
+        <w:rPr>
+          <w:lang w:val="ru-RU"/>
+        </w:rPr>
+        <w:t>3</w:t>
+      </w:r>
+      <w:bookmarkStart w:id="26" w:name="_Toc140087578_Копия_1"/>
+      <w:r>
+        <w:rPr>
+          <w:lang w:val="ru-RU"/>
+        </w:rPr>
+        <w:t xml:space="preserve">.1 </w:t>
+      </w:r>
       <w:bookmarkEnd w:id="26"/>
-      <w:r>
-        <w:rPr>
-          <w:lang w:val="ru-RU"/>
-        </w:rPr>
-        <w:t>3</w:t>
-      </w:r>
-      <w:bookmarkStart w:id="27" w:name="_Toc140087578_Копия_1"/>
-      <w:r>
-        <w:rPr>
-          <w:lang w:val="ru-RU"/>
-        </w:rPr>
-        <w:t xml:space="preserve">.1 </w:t>
-      </w:r>
-      <w:bookmarkEnd w:id="27"/>
       <w:r>
         <w:rPr>
           <w:lang w:val="ru-RU"/>
@@ -1465,7 +1448,7 @@
         </w:rPr>
         <w:t xml:space="preserve"> </w:t>
       </w:r>
-      <w:bookmarkStart w:id="28" w:name="__RefHeading___Toc12430_1734033060_Копия"/>
+      <w:bookmarkStart w:id="27" w:name="__RefHeading___Toc12430_1734033060_Копия"/>
     </w:p>
     <w:p>
       <w:pPr>
@@ -1474,27 +1457,19 @@
           <w:lang w:val="ru-RU"/>
         </w:rPr>
       </w:pPr>
-      <w:bookmarkStart w:id="29" w:name="__RefHeading___Toc1323_1361387627_Копия_"/>
+      <w:bookmarkStart w:id="28" w:name="__RefHeading___Toc1323_1361387627_Копия_"/>
+      <w:bookmarkEnd w:id="27"/>
       <w:bookmarkEnd w:id="28"/>
-      <w:bookmarkEnd w:id="29"/>
       <w:r>
         <w:rPr/>
         <w:t>3</w:t>
       </w:r>
-      <w:bookmarkStart w:id="30" w:name="_Toc140087579_Копия_1"/>
+      <w:bookmarkStart w:id="29" w:name="_Toc140087579_Копия_1"/>
       <w:r>
         <w:rPr/>
-        <w:t>.</w:t>
-      </w:r>
-      <w:r>
-        <w:rPr/>
-        <w:t>2</w:t>
-      </w:r>
-      <w:r>
-        <w:rPr/>
-        <w:t xml:space="preserve"> </w:t>
-      </w:r>
-      <w:bookmarkEnd w:id="30"/>
+        <w:t xml:space="preserve">.2 </w:t>
+      </w:r>
+      <w:bookmarkEnd w:id="29"/>
       <w:r>
         <w:rPr>
           <w:lang w:val="ru-RU"/>
@@ -1509,8 +1484,8 @@
           <w:lang w:val="ru-RU"/>
         </w:rPr>
       </w:pPr>
-      <w:bookmarkStart w:id="31" w:name="__RefHeading___Toc1340_1361387627"/>
-      <w:bookmarkEnd w:id="31"/>
+      <w:bookmarkStart w:id="30" w:name="__RefHeading___Toc1340_1361387627"/>
+      <w:bookmarkEnd w:id="30"/>
       <w:r>
         <w:rPr>
           <w:lang w:val="ru-RU"/>
@@ -1525,14 +1500,15 @@
           <w:lang w:val="ru-RU"/>
         </w:rPr>
       </w:pPr>
-      <w:bookmarkStart w:id="32" w:name="__RefHeading___Toc1342_1361387627"/>
-      <w:bookmarkEnd w:id="32"/>
+      <w:bookmarkStart w:id="31" w:name="__RefHeading___Toc1342_1361387627"/>
+      <w:bookmarkEnd w:id="31"/>
       <w:r>
         <w:rPr>
           <w:lang w:val="ru-RU"/>
         </w:rPr>
         <w:t>3.53 Гавноооооооо</w:t>
       </w:r>
+      <w:bookmarkStart w:id="32" w:name="__RefHeading___Toc1344_1361387627"/>
     </w:p>
     <w:p>
       <w:pPr>
@@ -1553,7 +1529,8 @@
           <w:lang w:val="ru-RU"/>
         </w:rPr>
       </w:pPr>
-      <w:bookmarkStart w:id="33" w:name="__RefHeading___Toc1344_1361387627"/>
+      <w:bookmarkStart w:id="33" w:name="__RefHeading___Toc1486_2414042469"/>
+      <w:bookmarkEnd w:id="32"/>
       <w:bookmarkEnd w:id="33"/>
       <w:r>
         <w:rPr>
@@ -1612,6 +1589,9 @@
           <w:lang w:val="ru-RU"/>
         </w:rPr>
       </w:r>
+      <w:bookmarkStart w:id="40" w:name="__RefHeading___Toc1325_1361387627"/>
+      <w:bookmarkStart w:id="41" w:name="__RefHeading___Toc1325_1361387627"/>
+      <w:bookmarkEnd w:id="41"/>
     </w:p>
     <w:p>
       <w:pPr>
@@ -1632,8 +1612,10 @@
           <w:lang w:val="ru-RU"/>
         </w:rPr>
       </w:pPr>
-      <w:bookmarkStart w:id="40" w:name="__RefHeading___Toc1325_1361387627"/>
-      <w:bookmarkEnd w:id="40"/>
+      <w:bookmarkStart w:id="42" w:name="__RefHeading___Toc1325_1361387627"/>
+      <w:bookmarkStart w:id="43" w:name="__RefHeading___Toc1488_2414042469"/>
+      <w:bookmarkEnd w:id="42"/>
+      <w:bookmarkEnd w:id="43"/>
       <w:r>
         <w:rPr/>
         <w:t xml:space="preserve"> </w:t>
@@ -1644,14 +1626,14 @@
         <w:pStyle w:val="-3"/>
         <w:rPr/>
       </w:pPr>
-      <w:bookmarkStart w:id="41" w:name="__RefHeading___Toc12448_1734033060"/>
-      <w:bookmarkStart w:id="42" w:name="_Toc140087588"/>
-      <w:bookmarkEnd w:id="41"/>
+      <w:bookmarkStart w:id="44" w:name="__RefHeading___Toc12448_1734033060"/>
+      <w:bookmarkStart w:id="45" w:name="_Toc140087588"/>
+      <w:bookmarkEnd w:id="44"/>
       <w:r>
         <w:rPr/>
         <w:t>ЗАКЛЮЧЕНИЕ</w:t>
       </w:r>
-      <w:bookmarkEnd w:id="42"/>
+      <w:bookmarkEnd w:id="45"/>
     </w:p>
     <w:p>
       <w:pPr>
@@ -1684,14 +1666,14 @@
         <w:pStyle w:val="-3"/>
         <w:rPr/>
       </w:pPr>
-      <w:bookmarkStart w:id="43" w:name="__RefHeading___Toc12452_1734033060"/>
-      <w:bookmarkStart w:id="44" w:name="_Toc140087590"/>
-      <w:bookmarkEnd w:id="43"/>
+      <w:bookmarkStart w:id="46" w:name="__RefHeading___Toc12452_1734033060"/>
+      <w:bookmarkStart w:id="47" w:name="_Toc140087590"/>
+      <w:bookmarkEnd w:id="46"/>
       <w:r>
         <w:rPr/>
         <w:t>ПРИЛОЖЕНИЕ А</w:t>
       </w:r>
-      <w:bookmarkEnd w:id="44"/>
+      <w:bookmarkEnd w:id="47"/>
     </w:p>
     <w:p>
       <w:pPr>
@@ -1810,14 +1792,14 @@
         <w:pStyle w:val="-3"/>
         <w:rPr/>
       </w:pPr>
-      <w:bookmarkStart w:id="45" w:name="__RefHeading___Toc12454_1734033060"/>
-      <w:bookmarkStart w:id="46" w:name="_Toc140087591"/>
-      <w:bookmarkEnd w:id="45"/>
+      <w:bookmarkStart w:id="48" w:name="__RefHeading___Toc12454_1734033060"/>
+      <w:bookmarkStart w:id="49" w:name="_Toc140087591"/>
+      <w:bookmarkEnd w:id="48"/>
       <w:r>
         <w:rPr/>
         <w:t>ПРИЛОЖЕНИЕ Б</w:t>
       </w:r>
-      <w:bookmarkEnd w:id="46"/>
+      <w:bookmarkEnd w:id="49"/>
     </w:p>
     <w:p>
       <w:pPr>
@@ -1946,14 +1928,14 @@
         <w:pStyle w:val="-3"/>
         <w:rPr/>
       </w:pPr>
-      <w:bookmarkStart w:id="47" w:name="__RefHeading___Toc12456_1734033060"/>
-      <w:bookmarkStart w:id="48" w:name="_Toc140087592"/>
-      <w:bookmarkEnd w:id="47"/>
+      <w:bookmarkStart w:id="50" w:name="__RefHeading___Toc12456_1734033060"/>
+      <w:bookmarkStart w:id="51" w:name="_Toc140087592"/>
+      <w:bookmarkEnd w:id="50"/>
       <w:r>
         <w:rPr/>
         <w:t>ПРИЛОЖЕНИЕ В</w:t>
       </w:r>
-      <w:bookmarkEnd w:id="48"/>
+      <w:bookmarkEnd w:id="51"/>
     </w:p>
     <w:p>
       <w:pPr>
@@ -2097,23 +2079,7 @@
         </w:pPr>
         <w:r>
           <w:rPr/>
-          <w:fldChar w:fldCharType="begin"/>
-        </w:r>
-        <w:r>
-          <w:rPr/>
-          <w:instrText xml:space="preserve"> PAGE </w:instrText>
-        </w:r>
-        <w:r>
-          <w:rPr/>
-          <w:fldChar w:fldCharType="separate"/>
-        </w:r>
-        <w:r>
-          <w:rPr/>
-          <w:t>10</w:t>
-        </w:r>
-        <w:r>
-          <w:rPr/>
-          <w:fldChar w:fldCharType="end"/>
+          <w:t>52</w:t>
         </w:r>
       </w:p>
     </w:sdtContent>
@@ -2452,13 +2418,8 @@
       <w:p>
         <w:pPr>
           <w:pStyle w:val="Footer"/>
-          <w:jc w:val="center"/>
-          <w:rPr>
-            <w:rFonts w:ascii="Times New Roman" w:hAnsi="Times New Roman" w:cs="Times New Roman"/>
-            <w:color w:themeColor="text1" w:val="000000"/>
-            <w:sz w:val="28"/>
-            <w:szCs w:val="28"/>
-          </w:rPr>
+          <w:jc w:val="right"/>
+          <w:rPr/>
         </w:pPr>
         <w:r>
           <w:rPr/>
@@ -2740,33 +2701,12 @@
       <w:p>
         <w:pPr>
           <w:pStyle w:val="Footer"/>
-          <w:jc w:val="center"/>
-          <w:rPr>
-            <w:rFonts w:ascii="Times New Roman" w:hAnsi="Times New Roman" w:cs="Times New Roman"/>
-            <w:color w:themeColor="text1" w:val="000000"/>
-            <w:sz w:val="28"/>
-            <w:szCs w:val="28"/>
-          </w:rPr>
+          <w:jc w:val="left"/>
+          <w:rPr/>
         </w:pPr>
         <w:r>
           <w:rPr/>
-          <w:fldChar w:fldCharType="begin"/>
-        </w:r>
-        <w:r>
-          <w:rPr/>
-          <w:instrText xml:space="preserve"> PAGE </w:instrText>
-        </w:r>
-        <w:r>
-          <w:rPr/>
-          <w:fldChar w:fldCharType="separate"/>
-        </w:r>
-        <w:r>
-          <w:rPr/>
-          <w:t>8</w:t>
-        </w:r>
-        <w:r>
-          <w:rPr/>
-          <w:fldChar w:fldCharType="end"/>
+          <w:t>9</w:t>
         </w:r>
       </w:p>
     </w:sdtContent>
@@ -2827,23 +2767,7 @@
         </w:pPr>
         <w:r>
           <w:rPr/>
-          <w:fldChar w:fldCharType="begin"/>
-        </w:r>
-        <w:r>
-          <w:rPr/>
-          <w:instrText xml:space="preserve"> PAGE </w:instrText>
-        </w:r>
-        <w:r>
-          <w:rPr/>
-          <w:fldChar w:fldCharType="separate"/>
-        </w:r>
-        <w:r>
-          <w:rPr/>
-          <w:t>9</w:t>
-        </w:r>
-        <w:r>
-          <w:rPr/>
-          <w:fldChar w:fldCharType="end"/>
+          <w:t>1</w:t>
         </w:r>
       </w:p>
     </w:sdtContent>
@@ -3574,6 +3498,13 @@
       <w:vertAlign w:val="superscript"/>
     </w:rPr>
   </w:style>
+  <w:style w:type="character" w:styleId="FootnoteCharacters211">
+    <w:name w:val="Footnote Characters211"/>
+    <w:qFormat/>
+    <w:rPr>
+      <w:vertAlign w:val="superscript"/>
+    </w:rPr>
+  </w:style>
   <w:style w:type="character" w:styleId="annotationreference">
     <w:name w:val="annotation reference"/>
     <w:basedOn w:val="DefaultParagraphFont"/>
@@ -3714,6 +3645,14 @@
   </w:style>
   <w:style w:type="character" w:styleId="InternetLink2">
     <w:name w:val="Internet Link2"/>
+    <w:qFormat/>
+    <w:rPr>
+      <w:color w:val="000080"/>
+      <w:u w:val="single"/>
+    </w:rPr>
+  </w:style>
+  <w:style w:type="character" w:styleId="InternetLink3">
+    <w:name w:val="Internet Link3"/>
     <w:qFormat/>
     <w:rPr>
       <w:color w:val="000080"/>
@@ -3893,7 +3832,7 @@
     <w:rsid w:val="00572b5b"/>
     <w:pPr>
       <w:tabs>
-        <w:tab w:val="clear" w:pos="708"/>
+        <w:tab w:val="clear" w:pos="643"/>
         <w:tab w:val="center" w:pos="4677" w:leader="none"/>
         <w:tab w:val="right" w:pos="9355" w:leader="none"/>
       </w:tabs>
@@ -3910,7 +3849,7 @@
     <w:rsid w:val="00572b5b"/>
     <w:pPr>
       <w:tabs>
-        <w:tab w:val="clear" w:pos="708"/>
+        <w:tab w:val="clear" w:pos="643"/>
         <w:tab w:val="center" w:pos="4677" w:leader="none"/>
         <w:tab w:val="right" w:pos="9355" w:leader="none"/>
       </w:tabs>
@@ -4050,7 +3989,7 @@
     <w:pPr>
       <w:widowControl/>
       <w:tabs>
-        <w:tab w:val="clear" w:pos="708"/>
+        <w:tab w:val="clear" w:pos="643"/>
         <w:tab w:val="left" w:pos="1134" w:leader="none"/>
       </w:tabs>
       <w:suppressAutoHyphens w:val="true"/>

</xml_diff>